<commit_message>
Finalize Research 1.0 public release
</commit_message>
<xml_diff>
--- a/audit/audit_report.docx
+++ b/audit/audit_report.docx
@@ -882,7 +882,7 @@
               <w:rPr>
                 <w:rFonts w:ascii="Arial" w:hAnsi="Arial" w:cs="Arial"/>
               </w:rPr>
-              <w:t>Pending final review</w:t>
+              <w:t>Public-safe analysis files prepared; original question materials remain withheld pending source and permission review</w:t>
             </w:r>
           </w:p>
         </w:tc>
@@ -1342,119 +1342,28 @@
     <w:p>
       <w:pPr>
         <w:rPr>
-          <w:rFonts w:ascii="Arial" w:hAnsi="Arial" w:cs="Arial"/>
-        </w:rPr>
-      </w:pPr>
-      <w:r>
-        <w:rPr>
-          <w:rFonts w:ascii="Arial" w:hAnsi="Arial" w:cs="Arial"/>
-        </w:rPr>
-        <w:t xml:space="preserve">Issue 4: </w:t>
-      </w:r>
-      <w:r>
-        <w:rPr>
-          <w:rFonts w:ascii="Arial" w:hAnsi="Arial" w:cs="Arial"/>
-        </w:rPr>
-        <w:t>Q</w:t>
-      </w:r>
-      <w:r>
-        <w:rPr>
-          <w:rFonts w:ascii="Arial" w:hAnsi="Arial" w:cs="Arial"/>
-        </w:rPr>
-        <w:t xml:space="preserve">uestion </w:t>
-      </w:r>
-      <w:r>
-        <w:rPr>
-          <w:rFonts w:ascii="Arial" w:hAnsi="Arial" w:cs="Arial"/>
-        </w:rPr>
-        <w:t>R</w:t>
-      </w:r>
-      <w:r>
-        <w:rPr>
-          <w:rFonts w:ascii="Arial" w:hAnsi="Arial" w:cs="Arial"/>
-        </w:rPr>
-        <w:t>eproducibility</w:t>
-      </w:r>
-    </w:p>
-    <w:p>
-      <w:pPr>
-        <w:rPr>
-          <w:rFonts w:ascii="Arial" w:hAnsi="Arial" w:cs="Arial"/>
-        </w:rPr>
-      </w:pPr>
-      <w:r>
-        <w:rPr>
-          <w:rFonts w:ascii="Arial" w:hAnsi="Arial" w:cs="Arial"/>
-        </w:rPr>
-        <w:t xml:space="preserve">Question 24 originally referred to </w:t>
-      </w:r>
-      <w:r>
-        <w:rPr>
-          <w:rFonts w:ascii="Arial" w:hAnsi="Arial" w:cs="Arial"/>
-        </w:rPr>
-        <w:t>“</w:t>
-      </w:r>
-      <w:r>
-        <w:rPr>
-          <w:rFonts w:ascii="Arial" w:hAnsi="Arial" w:cs="Arial"/>
-        </w:rPr>
-        <w:t>the graph above,</w:t>
-      </w:r>
-      <w:r>
-        <w:rPr>
-          <w:rFonts w:ascii="Arial" w:hAnsi="Arial" w:cs="Arial"/>
-        </w:rPr>
-        <w:t>”</w:t>
-      </w:r>
-      <w:r>
-        <w:rPr>
-          <w:rFonts w:ascii="Arial" w:hAnsi="Arial" w:cs="Arial"/>
-        </w:rPr>
-        <w:t xml:space="preserve"> </w:t>
-      </w:r>
-      <w:r>
-        <w:rPr>
-          <w:rFonts w:ascii="Arial" w:hAnsi="Arial" w:cs="Arial"/>
-        </w:rPr>
-        <w:t>but the graph was unable to be copied into the table. So, t</w:t>
-      </w:r>
-      <w:r>
-        <w:rPr>
-          <w:rFonts w:ascii="Arial" w:hAnsi="Arial" w:cs="Arial"/>
-        </w:rPr>
-        <w:t xml:space="preserve">he question was rewritten as a text-based directed-graph problem by listing all directed edges:  A → B, B → C, C → E, D → B, E → D, and E → F.  The reference-answer formatting was also corrected from d[b] to </w:t>
-      </w:r>
-      <w:r>
-        <w:rPr>
-          <w:rFonts w:ascii="Arial" w:hAnsi="Arial" w:cs="Arial"/>
-        </w:rPr>
-        <w:t>d</w:t>
-      </w:r>
-      <w:r>
-        <w:rPr>
-          <w:rFonts w:ascii="Arial" w:hAnsi="Arial" w:cs="Arial"/>
-        </w:rPr>
-        <w:t>: [</w:t>
-      </w:r>
-      <w:r>
-        <w:rPr>
-          <w:rFonts w:ascii="Arial" w:hAnsi="Arial" w:cs="Arial"/>
-        </w:rPr>
-        <w:t>b</w:t>
-      </w:r>
-      <w:r>
-        <w:rPr>
-          <w:rFonts w:ascii="Arial" w:hAnsi="Arial" w:cs="Arial"/>
-        </w:rPr>
-        <w:t>].</w:t>
-      </w:r>
-    </w:p>
-    <w:p>
-      <w:pPr>
-        <w:rPr>
-          <w:rFonts w:ascii="Arial" w:hAnsi="Arial" w:cs="Arial"/>
-        </w:rPr>
-      </w:pPr>
+          <w:rFonts w:ascii="Arial" w:hAnsi="Arial" w:cs="Arial" w:hint="eastAsia"/>
+        </w:rPr>
+      </w:pPr>
+      <w:r>
+        <w:rPr>
+          <w:rFonts w:ascii="Arial" w:hAnsi="Arial" w:cs="Arial"/>
+        </w:rPr>
+        <w:t>Issue 4: Question Reproducibility</w:t>
+      </w:r>
+    </w:p>
+    <w:p>
+      <w:pPr>
+        <w:rPr>
+          <w:rFonts w:ascii="Arial" w:hAnsi="Arial" w:cs="Arial"/>
+        </w:rPr>
+      </w:pPr>
+      <w:r>
+        <w:rPr>
+          <w:rFonts w:ascii="Arial" w:hAnsi="Arial" w:cs="Arial"/>
+        </w:rPr>
+        <w:t>Question 24 originally referred to “the graph above,” but the graphical stimulus was not preserved in the tabular dataset. For archival reproducibility, a normalized text-based version of the question was created using the graph information available from the original material. The public audit report does not reproduce the complete graph specification because the underlying question materials remain pending source and permission review. The original administered context and the later archival normalization are documented separately in the private internal dataset.</w:t>
+      </w:r>
     </w:p>
     <w:p>
       <w:pPr>
@@ -1735,6 +1644,7 @@
         <w:rPr>
           <w:rFonts w:ascii="Arial" w:hAnsi="Arial" w:cs="Arial" w:hint="eastAsia"/>
         </w:rPr>
+        <w:lastRenderedPageBreak/>
         <w:t xml:space="preserve">For Question 24, Qwen introduced a nonexistent B </w:t>
       </w:r>
       <w:r>
@@ -1773,7 +1683,6 @@
         <w:rPr>
           <w:rFonts w:ascii="Arial" w:hAnsi="Arial" w:cs="Arial"/>
         </w:rPr>
-        <w:lastRenderedPageBreak/>
         <w:t>For Question 28, Qwen correctly identified the overall Θ(n²) complexity but incorrectly stated that the third loop did not actually reverse the list. Its scores were revised from 3,3,3,3 to 2,2,3,2, and the response was annotated as a moderate conceptual error.</w:t>
       </w:r>
     </w:p>
@@ -1928,6 +1837,26 @@
         <w:rPr>
           <w:rFonts w:ascii="Arial" w:hAnsi="Arial" w:cs="Arial"/>
         </w:rPr>
+        <w:t>The following results describe the audited MVP v2 dataset at that stage of the project and are retained here as part of the audit history. They were later superseded by the final Research Version 1.0 results after additional review and score corrections.</w:t>
+      </w:r>
+    </w:p>
+    <w:p>
+      <w:pPr>
+        <w:rPr>
+          <w:rFonts w:ascii="Arial" w:hAnsi="Arial" w:cs="Arial"/>
+        </w:rPr>
+      </w:pPr>
+    </w:p>
+    <w:p>
+      <w:pPr>
+        <w:rPr>
+          <w:rFonts w:ascii="Arial" w:hAnsi="Arial" w:cs="Arial"/>
+        </w:rPr>
+      </w:pPr>
+      <w:r>
+        <w:rPr>
+          <w:rFonts w:ascii="Arial" w:hAnsi="Arial" w:cs="Arial"/>
+        </w:rPr>
         <w:t>Following the MVP v2 corrections, the analysis Notebook was rerun from a clean kernel using the revised dataset. All validation checks passed, and the analysis and figures were regenerated successfully.</w:t>
       </w:r>
     </w:p>
@@ -2033,6 +1962,7 @@
           <w:sz w:val="28"/>
           <w:szCs w:val="28"/>
         </w:rPr>
+        <w:lastRenderedPageBreak/>
         <w:t>Source CSV Blank-Row Cleanup</w:t>
       </w:r>
     </w:p>
@@ -2084,7 +2014,6 @@
           <w:sz w:val="28"/>
           <w:szCs w:val="28"/>
         </w:rPr>
-        <w:lastRenderedPageBreak/>
         <w:t>Sequential Collection and Context Dependency</w:t>
       </w:r>
     </w:p>
@@ -2387,6 +2316,7 @@
         <w:rPr>
           <w:rFonts w:ascii="Arial" w:hAnsi="Arial" w:cs="Arial"/>
         </w:rPr>
+        <w:lastRenderedPageBreak/>
         <w:t>• 30 unique questions;</w:t>
       </w:r>
     </w:p>
@@ -2503,7 +2433,6 @@
         <w:rPr>
           <w:rFonts w:ascii="Arial" w:hAnsi="Arial" w:cs="Arial"/>
         </w:rPr>
-        <w:lastRenderedPageBreak/>
         <w:t>• 0 duplicate question-model combinations;</w:t>
       </w:r>
     </w:p>
@@ -2561,7 +2490,27 @@
           <w:sz w:val="32"/>
           <w:szCs w:val="32"/>
         </w:rPr>
-        <w:t>Remaining Limitations</w:t>
+        <w:t>Remaining Limitations at the End of MVP v2</w:t>
+      </w:r>
+    </w:p>
+    <w:p>
+      <w:pPr>
+        <w:rPr>
+          <w:rFonts w:ascii="Arial" w:hAnsi="Arial" w:cs="Arial"/>
+        </w:rPr>
+      </w:pPr>
+    </w:p>
+    <w:p>
+      <w:pPr>
+        <w:rPr>
+          <w:rFonts w:ascii="Arial" w:hAnsi="Arial" w:cs="Arial"/>
+        </w:rPr>
+      </w:pPr>
+      <w:r>
+        <w:rPr>
+          <w:rFonts w:ascii="Arial" w:hAnsi="Arial" w:cs="Arial"/>
+        </w:rPr>
+        <w:t>The limitations below describe the project at the end of the MVP v2 stage and are retained as part of the audit history. Several of these limitations were subsequently addressed in Research Version 1.0.</w:t>
       </w:r>
     </w:p>
     <w:p>
@@ -2691,13 +2640,13 @@
           <w:sz w:val="32"/>
           <w:szCs w:val="32"/>
         </w:rPr>
-        <w:t>Conclusion</w:t>
-      </w:r>
-    </w:p>
-    <w:p>
-      <w:pPr>
-        <w:rPr>
-          <w:rFonts w:ascii="Arial" w:hAnsi="Arial" w:cs="Arial"/>
+        <w:t>MVP v2 Audit Conclusion</w:t>
+      </w:r>
+    </w:p>
+    <w:p>
+      <w:pPr>
+        <w:rPr>
+          <w:rFonts w:ascii="Arial" w:hAnsi="Arial" w:cs="Arial" w:hint="eastAsia"/>
         </w:rPr>
       </w:pPr>
     </w:p>
@@ -2751,6 +2700,7 @@
         <w:rPr>
           <w:rFonts w:ascii="Arial" w:hAnsi="Arial" w:cs="Arial"/>
         </w:rPr>
+        <w:lastRenderedPageBreak/>
         <w:t>Second-rater reliability analysis, confidence intervals, statistical inference, difficulty-level analysis, model profiling, expanded error analysis, and qualitative case studies are planned for Research Version 1.0.</w:t>
       </w:r>
     </w:p>
@@ -2831,7 +2781,6 @@
           <w:sz w:val="32"/>
           <w:szCs w:val="32"/>
         </w:rPr>
-        <w:lastRenderedPageBreak/>
         <w:t>Research Version 1.0 Review</w:t>
       </w:r>
     </w:p>
@@ -3118,6 +3067,7 @@
         <w:rPr>
           <w:rFonts w:ascii="Arial" w:hAnsi="Arial" w:cs="Arial"/>
         </w:rPr>
+        <w:lastRenderedPageBreak/>
         <w:t>I added rater_protocol.md to record how the second rater was prepared, how the 32 responses were selected, what materials were provided, how the ratings were completed, and how the agreement results were analyzed.</w:t>
       </w:r>
     </w:p>
@@ -3258,75 +3208,13 @@
         <w:rPr>
           <w:rFonts w:ascii="Arial" w:hAnsi="Arial" w:cs="Arial"/>
         </w:rPr>
-        <w:t>Review of questions.csv found that all 30 questions were marked as public even though the source and licensing review had not been completed.</w:t>
-      </w:r>
-    </w:p>
-    <w:p>
-      <w:pPr>
-        <w:rPr>
-          <w:rFonts w:ascii="Arial" w:hAnsi="Arial" w:cs="Arial"/>
-        </w:rPr>
-      </w:pPr>
-    </w:p>
-    <w:p>
-      <w:pPr>
-        <w:rPr>
-          <w:rFonts w:ascii="Arial" w:hAnsi="Arial" w:cs="Arial"/>
-        </w:rPr>
-      </w:pPr>
-      <w:r>
-        <w:rPr>
-          <w:rFonts w:ascii="Arial" w:hAnsi="Arial" w:cs="Arial"/>
-        </w:rPr>
-        <w:t xml:space="preserve">I changed </w:t>
-      </w:r>
-      <w:proofErr w:type="spellStart"/>
-      <w:r>
-        <w:rPr>
-          <w:rFonts w:ascii="Arial" w:hAnsi="Arial" w:cs="Arial"/>
-        </w:rPr>
-        <w:t>public_release_status</w:t>
-      </w:r>
-      <w:proofErr w:type="spellEnd"/>
-      <w:r>
-        <w:rPr>
-          <w:rFonts w:ascii="Arial" w:hAnsi="Arial" w:cs="Arial"/>
-        </w:rPr>
-        <w:t xml:space="preserve"> from public to </w:t>
-      </w:r>
-      <w:proofErr w:type="spellStart"/>
-      <w:r>
-        <w:rPr>
-          <w:rFonts w:ascii="Arial" w:hAnsi="Arial" w:cs="Arial"/>
-        </w:rPr>
-        <w:t>pending_source_review</w:t>
-      </w:r>
-      <w:proofErr w:type="spellEnd"/>
-      <w:r>
-        <w:rPr>
-          <w:rFonts w:ascii="Arial" w:hAnsi="Arial" w:cs="Arial"/>
-        </w:rPr>
-        <w:t xml:space="preserve"> for all 30 questions. </w:t>
-      </w:r>
-      <w:proofErr w:type="gramStart"/>
-      <w:r>
-        <w:rPr>
-          <w:rFonts w:ascii="Arial" w:hAnsi="Arial" w:cs="Arial"/>
-        </w:rPr>
-        <w:t>This only changes</w:t>
-      </w:r>
-      <w:proofErr w:type="gramEnd"/>
-      <w:r>
-        <w:rPr>
-          <w:rFonts w:ascii="Arial" w:hAnsi="Arial" w:cs="Arial"/>
-        </w:rPr>
-        <w:t xml:space="preserve"> how the questions are labeled for release; it does not change the questions, responses, scores, or analysis.</w:t>
-      </w:r>
-    </w:p>
-    <w:p>
-      <w:pPr>
-        <w:rPr>
-          <w:rFonts w:ascii="Arial" w:hAnsi="Arial" w:cs="Arial"/>
+        <w:t>Public-safe analysis files prepared; original question materials remain withheld pending source and permission review</w:t>
+      </w:r>
+    </w:p>
+    <w:p>
+      <w:pPr>
+        <w:rPr>
+          <w:rFonts w:ascii="Arial" w:hAnsi="Arial" w:cs="Arial" w:hint="eastAsia"/>
         </w:rPr>
       </w:pPr>
     </w:p>
@@ -3446,7 +3334,14 @@
         <w:rPr>
           <w:rFonts w:ascii="Arial" w:hAnsi="Arial" w:cs="Arial"/>
         </w:rPr>
-        <w:t>The statistical results were unchanged after the final run. The overall Friedman test was still not significant at the 0.05 level. Tutoring Effectiveness was still significant after the Holm correction, and the ChatGPT-Grok comparison was still the only significant pair in the follow-up tests. The second-rater agreement results were also unchanged.</w:t>
+        <w:t xml:space="preserve">The statistical results were unchanged after the final run. The overall Friedman test was still not significant at the 0.05 level. Tutoring Effectiveness was still significant after the </w:t>
+      </w:r>
+      <w:r>
+        <w:rPr>
+          <w:rFonts w:ascii="Arial" w:hAnsi="Arial" w:cs="Arial"/>
+        </w:rPr>
+        <w:lastRenderedPageBreak/>
+        <w:t>Holm correction, and the ChatGPT-Grok comparison was still the only significant pair in the follow-up tests. The second-rater agreement results were also unchanged.</w:t>
       </w:r>
     </w:p>
     <w:p>
@@ -3470,6 +3365,150 @@
           <w:sz w:val="28"/>
           <w:szCs w:val="28"/>
         </w:rPr>
+        <w:t>Final Research 1.0 Validation and Public Packaging</w:t>
+      </w:r>
+    </w:p>
+    <w:p>
+      <w:pPr>
+        <w:rPr>
+          <w:rFonts w:ascii="Arial" w:hAnsi="Arial" w:cs="Arial"/>
+        </w:rPr>
+      </w:pPr>
+    </w:p>
+    <w:p>
+      <w:pPr>
+        <w:rPr>
+          <w:rFonts w:ascii="Arial" w:hAnsi="Arial" w:cs="Arial"/>
+        </w:rPr>
+      </w:pPr>
+      <w:r>
+        <w:rPr>
+          <w:rFonts w:ascii="Arial" w:hAnsi="Arial" w:cs="Arial"/>
+        </w:rPr>
+        <w:t>After the initial Research Version 1.0 review, a final validation and public-packaging pass was completed.</w:t>
+      </w:r>
+    </w:p>
+    <w:p>
+      <w:pPr>
+        <w:rPr>
+          <w:rFonts w:ascii="Arial" w:hAnsi="Arial" w:cs="Arial"/>
+        </w:rPr>
+      </w:pPr>
+    </w:p>
+    <w:p>
+      <w:pPr>
+        <w:rPr>
+          <w:rFonts w:ascii="Arial" w:hAnsi="Arial" w:cs="Arial"/>
+        </w:rPr>
+      </w:pPr>
+      <w:r>
+        <w:rPr>
+          <w:rFonts w:ascii="Arial" w:hAnsi="Arial" w:cs="Arial"/>
+        </w:rPr>
+        <w:t>During this review, the Q29–Qwen response was corrected after identifying a minor conceptual error in an auxiliary statement about singly linked-list deletion. The final scores for this response are Accuracy = 2, Reasoning Completeness = 3, Explanation Clarity = 3, and Tutoring Effectiveness = 2, with an Overall Score of 2.50. The complete analysis was rerun after this correction, and all reported descriptive, inferential, and inter-rater reliability results were updated accordingly.</w:t>
+      </w:r>
+    </w:p>
+    <w:p>
+      <w:pPr>
+        <w:rPr>
+          <w:rFonts w:ascii="Arial" w:hAnsi="Arial" w:cs="Arial"/>
+        </w:rPr>
+      </w:pPr>
+    </w:p>
+    <w:p>
+      <w:pPr>
+        <w:rPr>
+          <w:rFonts w:ascii="Arial" w:hAnsi="Arial" w:cs="Arial"/>
+        </w:rPr>
+      </w:pPr>
+      <w:r>
+        <w:rPr>
+          <w:rFonts w:ascii="Arial" w:hAnsi="Arial" w:cs="Arial"/>
+        </w:rPr>
+        <w:t>To separate reproducible analysis data from materials still pending source and permission review, two public-safe datasets were created: public_analysis_scores.csv and public_second_rater_scores.csv. These files contain the score and annotation fields needed for the public quantitative analysis without reproducing question text, raw model responses, or private reference answers. The analysis notebook was updated to use these public-safe files and successfully completed a clean-kernel Run All.</w:t>
+      </w:r>
+    </w:p>
+    <w:p>
+      <w:pPr>
+        <w:rPr>
+          <w:rFonts w:ascii="Arial" w:hAnsi="Arial" w:cs="Arial"/>
+        </w:rPr>
+      </w:pPr>
+    </w:p>
+    <w:p>
+      <w:pPr>
+        <w:rPr>
+          <w:rFonts w:ascii="Arial" w:hAnsi="Arial" w:cs="Arial"/>
+        </w:rPr>
+      </w:pPr>
+      <w:r>
+        <w:rPr>
+          <w:rFonts w:ascii="Arial" w:hAnsi="Arial" w:cs="Arial"/>
+        </w:rPr>
+        <w:t>The final documentation review also clarified several methodological limitations. The evaluation documentation now states that model identities were visible during primary and second-rater scoring, that the Overall Score uses an equal-weight average as a methodological choice rather than a validated weighting scheme, and that the manually assigned learning-behavior tags are descriptive annotations rather than validated educational measurements. Public qualitative case-study descriptions were also revised where necessary to avoid reproducing question materials that remain pending source and permission review.</w:t>
+      </w:r>
+    </w:p>
+    <w:p>
+      <w:pPr>
+        <w:rPr>
+          <w:rFonts w:ascii="Arial" w:hAnsi="Arial" w:cs="Arial"/>
+        </w:rPr>
+      </w:pPr>
+    </w:p>
+    <w:p>
+      <w:pPr>
+        <w:rPr>
+          <w:rFonts w:ascii="Arial" w:hAnsi="Arial" w:cs="Arial"/>
+        </w:rPr>
+      </w:pPr>
+      <w:r>
+        <w:rPr>
+          <w:rFonts w:ascii="Arial" w:hAnsi="Arial" w:cs="Arial"/>
+        </w:rPr>
+        <w:t>Finally, the Python environment used for the successful final analysis was documented, and the package versions in requirements.txt were pinned to the versions used during the final reproducibility check.</w:t>
+      </w:r>
+    </w:p>
+    <w:p>
+      <w:pPr>
+        <w:rPr>
+          <w:rFonts w:ascii="Arial" w:hAnsi="Arial" w:cs="Arial"/>
+        </w:rPr>
+      </w:pPr>
+    </w:p>
+    <w:p>
+      <w:pPr>
+        <w:rPr>
+          <w:rFonts w:ascii="Arial" w:hAnsi="Arial" w:cs="Arial" w:hint="eastAsia"/>
+        </w:rPr>
+      </w:pPr>
+      <w:r>
+        <w:rPr>
+          <w:rFonts w:ascii="Arial" w:hAnsi="Arial" w:cs="Arial"/>
+        </w:rPr>
+        <w:t>No additional model responses were collected during this final validation, and no scoring changes were made after the Q29–Qwen correction.</w:t>
+      </w:r>
+    </w:p>
+    <w:p>
+      <w:pPr>
+        <w:rPr>
+          <w:rFonts w:ascii="Arial" w:hAnsi="Arial" w:cs="Arial"/>
+        </w:rPr>
+      </w:pPr>
+    </w:p>
+    <w:p>
+      <w:pPr>
+        <w:rPr>
+          <w:rFonts w:ascii="Arial" w:hAnsi="Arial" w:cs="Arial"/>
+          <w:sz w:val="28"/>
+          <w:szCs w:val="28"/>
+        </w:rPr>
+      </w:pPr>
+      <w:r>
+        <w:rPr>
+          <w:rFonts w:ascii="Arial" w:hAnsi="Arial" w:cs="Arial"/>
+          <w:sz w:val="28"/>
+          <w:szCs w:val="28"/>
+        </w:rPr>
         <w:t>Research Version 1.0 Review Conclusion</w:t>
       </w:r>
     </w:p>
@@ -3490,34 +3529,54 @@
         <w:rPr>
           <w:rFonts w:ascii="Arial" w:hAnsi="Arial" w:cs="Arial"/>
         </w:rPr>
-        <w:t xml:space="preserve">The Research 1.0 review found several problems with the project package, including an outdated notebook, missing dependencies, incomplete documentation of the evaluation </w:t>
-      </w:r>
+        <w:t>The Research 1.0 review found several problems with the project package, including an outdated notebook, missing dependencies, incomplete documentation of the evaluation and second-rater procedures, inconsistent release-status labels, and the notebook path issue described above. These issues were corrected during the review.</w:t>
+      </w:r>
+    </w:p>
+    <w:p>
+      <w:pPr>
+        <w:rPr>
+          <w:rFonts w:ascii="Arial" w:hAnsi="Arial" w:cs="Arial"/>
+        </w:rPr>
+      </w:pPr>
+    </w:p>
+    <w:p>
+      <w:pPr>
+        <w:rPr>
+          <w:rFonts w:ascii="Arial" w:hAnsi="Arial" w:cs="Arial"/>
+        </w:rPr>
+      </w:pPr>
       <w:r>
         <w:rPr>
           <w:rFonts w:ascii="Arial" w:hAnsi="Arial" w:cs="Arial"/>
         </w:rPr>
         <w:lastRenderedPageBreak/>
-        <w:t>and second-rater procedures, inconsistent release-status labels, and the notebook path issue described above. These issues were corrected during the review.</w:t>
-      </w:r>
-    </w:p>
-    <w:p>
-      <w:pPr>
-        <w:rPr>
-          <w:rFonts w:ascii="Arial" w:hAnsi="Arial" w:cs="Arial"/>
-        </w:rPr>
-      </w:pPr>
-    </w:p>
-    <w:p>
-      <w:pPr>
-        <w:rPr>
-          <w:rFonts w:ascii="Arial" w:hAnsi="Arial" w:cs="Arial"/>
-        </w:rPr>
-      </w:pPr>
-      <w:r>
-        <w:rPr>
-          <w:rFonts w:ascii="Arial" w:hAnsi="Arial" w:cs="Arial"/>
-        </w:rPr>
-        <w:t>None of these corrections required collecting the model responses again or changing the audited MVP v2 scores. After the corrections, I was able to run the complete Research 1.0 notebook from a clean kernel without errors and reproduce the same analysis results.</w:t>
+        <w:t xml:space="preserve">None of these corrections required collecting the model responses again. The final scoring dataset reflects the documented Research 1.0 review corrections, including the final Q29–Qwen correction described </w:t>
+      </w:r>
+      <w:proofErr w:type="spellStart"/>
+      <w:r>
+        <w:rPr>
+          <w:rFonts w:ascii="Arial" w:hAnsi="Arial" w:cs="Arial"/>
+        </w:rPr>
+        <w:t>above.</w:t>
+      </w:r>
+      <w:r>
+        <w:rPr>
+          <w:rFonts w:ascii="Arial" w:hAnsi="Arial" w:cs="Arial" w:hint="eastAsia"/>
+        </w:rPr>
+        <w:t xml:space="preserve"> </w:t>
+      </w:r>
+      <w:r>
+        <w:rPr>
+          <w:rFonts w:ascii="Arial" w:hAnsi="Arial" w:cs="Arial"/>
+        </w:rPr>
+        <w:t>Afte</w:t>
+      </w:r>
+      <w:proofErr w:type="spellEnd"/>
+      <w:r>
+        <w:rPr>
+          <w:rFonts w:ascii="Arial" w:hAnsi="Arial" w:cs="Arial"/>
+        </w:rPr>
+        <w:t>r the corrections, I was able to run the complete Research 1.0 notebook from a clean kernel without errors and reproduce the same analysis results.</w:t>
       </w:r>
     </w:p>
     <w:p>

</xml_diff>